<commit_message>
added new file and modified sample
</commit_message>
<xml_diff>
--- a/sample.docx
+++ b/sample.docx
@@ -13,6 +13,11 @@
       </w:r>
       <w:r>
         <w:t xml:space="preserve"> </w:t>
+      </w:r>
+    </w:p>
+    <w:p>
+      <w:r>
+        <w:t>Import matplotlib.pyplot as plt</w:t>
       </w:r>
     </w:p>
     <w:sectPr>

</xml_diff>